<commit_message>
Reorganize and restyle Skills, Resourcces and Projects section
</commit_message>
<xml_diff>
--- a/rn-porfolio content.docx
+++ b/rn-porfolio content.docx
@@ -868,21 +868,7 @@
         <w:rPr>
           <w:rFonts w:ascii="Arial" w:hAnsi="Arial" w:cs="Arial"/>
         </w:rPr>
-        <w:t xml:space="preserve">React, TypeScript, Storybook, Styled Components, Jest, </w:t>
-      </w:r>
-      <w:proofErr w:type="spellStart"/>
-      <w:r>
-        <w:rPr>
-          <w:rFonts w:ascii="Arial" w:hAnsi="Arial" w:cs="Arial"/>
-        </w:rPr>
-        <w:t>ESLint</w:t>
-      </w:r>
-      <w:proofErr w:type="spellEnd"/>
-      <w:r>
-        <w:rPr>
-          <w:rFonts w:ascii="Arial" w:hAnsi="Arial" w:cs="Arial"/>
-        </w:rPr>
-        <w:t>, Prettier, Husky, Docker, GitHub Actions</w:t>
+        <w:t>React, TypeScript, Storybook, Styled Components, Jest, ESLint, Prettier, Husky, Docker, GitHub Actions</w:t>
       </w:r>
     </w:p>
     <w:p>
@@ -998,19 +984,24 @@
           <w:lang w:eastAsia="en-US"/>
           <w14:ligatures w14:val="standardContextual"/>
         </w:rPr>
-        <w:t xml:space="preserve">Implemented automated testing and code quality checks (Jest, </w:t>
-      </w:r>
-      <w:proofErr w:type="spellStart"/>
-      <w:r>
+        <w:t>Implemented automated testing and code quality checks (Jest, ESLint, Prettier, Husky) to enforce consistency before commits</w:t>
+      </w:r>
+    </w:p>
+    <w:p>
+      <w:pPr>
+        <w:pStyle w:val="NormalWeb"/>
+        <w:numPr>
+          <w:ilvl w:val="0"/>
+          <w:numId w:val="3"/>
+        </w:numPr>
+        <w:spacing w:after="0" w:afterAutospacing="0"/>
         <w:rPr>
           <w:rFonts w:ascii="Arial" w:eastAsiaTheme="minorHAnsi" w:hAnsi="Arial" w:cs="Arial"/>
           <w:kern w:val="2"/>
           <w:lang w:eastAsia="en-US"/>
           <w14:ligatures w14:val="standardContextual"/>
         </w:rPr>
-        <w:t>ESLint</w:t>
-      </w:r>
-      <w:proofErr w:type="spellEnd"/>
+      </w:pPr>
       <w:r>
         <w:rPr>
           <w:rFonts w:ascii="Arial" w:eastAsiaTheme="minorHAnsi" w:hAnsi="Arial" w:cs="Arial"/>
@@ -1018,31 +1009,6 @@
           <w:lang w:eastAsia="en-US"/>
           <w14:ligatures w14:val="standardContextual"/>
         </w:rPr>
-        <w:t>, Prettier, Husky) to enforce consistency before commits</w:t>
-      </w:r>
-    </w:p>
-    <w:p>
-      <w:pPr>
-        <w:pStyle w:val="NormalWeb"/>
-        <w:numPr>
-          <w:ilvl w:val="0"/>
-          <w:numId w:val="3"/>
-        </w:numPr>
-        <w:spacing w:after="0" w:afterAutospacing="0"/>
-        <w:rPr>
-          <w:rFonts w:ascii="Arial" w:eastAsiaTheme="minorHAnsi" w:hAnsi="Arial" w:cs="Arial"/>
-          <w:kern w:val="2"/>
-          <w:lang w:eastAsia="en-US"/>
-          <w14:ligatures w14:val="standardContextual"/>
-        </w:rPr>
-      </w:pPr>
-      <w:r>
-        <w:rPr>
-          <w:rFonts w:ascii="Arial" w:eastAsiaTheme="minorHAnsi" w:hAnsi="Arial" w:cs="Arial"/>
-          <w:kern w:val="2"/>
-          <w:lang w:eastAsia="en-US"/>
-          <w14:ligatures w14:val="standardContextual"/>
-        </w:rPr>
         <w:t>Containerized the application with Docker and configured CI/CD pipelines using GitHub Actions for automated testing and deployment</w:t>
       </w:r>
     </w:p>
@@ -1281,15 +1247,7 @@
         </w:numPr>
       </w:pPr>
       <w:r>
-        <w:t xml:space="preserve">Practice: </w:t>
-      </w:r>
-      <w:proofErr w:type="spellStart"/>
-      <w:r>
-        <w:t>LeetCode</w:t>
-      </w:r>
-      <w:proofErr w:type="spellEnd"/>
-      <w:r>
-        <w:t xml:space="preserve"> </w:t>
+        <w:t xml:space="preserve">Practice: LeetCode </w:t>
       </w:r>
     </w:p>
     <w:p>
@@ -1334,23 +1292,7 @@
         </w:numPr>
       </w:pPr>
       <w:r>
-        <w:t xml:space="preserve">Editor: VS Code (with extensions: Prettier, </w:t>
-      </w:r>
-      <w:proofErr w:type="spellStart"/>
-      <w:r>
-        <w:t>ESLint</w:t>
-      </w:r>
-      <w:proofErr w:type="spellEnd"/>
-      <w:r>
-        <w:t xml:space="preserve">, </w:t>
-      </w:r>
-      <w:proofErr w:type="spellStart"/>
-      <w:r>
-        <w:t>GitLens</w:t>
-      </w:r>
-      <w:proofErr w:type="spellEnd"/>
-      <w:r>
-        <w:t xml:space="preserve">) </w:t>
+        <w:t xml:space="preserve">Editor: VS Code (with extensions: Prettier, ESLint, GitLens) </w:t>
       </w:r>
     </w:p>
     <w:p>
@@ -1386,15 +1328,7 @@
         </w:numPr>
       </w:pPr>
       <w:r>
-        <w:t xml:space="preserve">Package Managers: </w:t>
-      </w:r>
-      <w:proofErr w:type="spellStart"/>
-      <w:r>
-        <w:t>npm</w:t>
-      </w:r>
-      <w:proofErr w:type="spellEnd"/>
-      <w:r>
-        <w:t>, pip</w:t>
+        <w:t>Package Managers: npm, pip</w:t>
       </w:r>
     </w:p>
     <w:p>
@@ -1413,6 +1347,48 @@
       </w:r>
       <w:r>
         <w:t xml:space="preserve"> DevTools</w:t>
+      </w:r>
+    </w:p>
+    <w:p/>
+    <w:p>
+      <w:r>
+        <w:t>ProjectsSection.tsx</w:t>
+      </w:r>
+    </w:p>
+    <w:p>
+      <w:r>
+        <w:t>Img</w:t>
+      </w:r>
+    </w:p>
+    <w:p>
+      <w:r>
+        <w:t>Text</w:t>
+      </w:r>
+    </w:p>
+    <w:p>
+      <w:r>
+        <w:t>Button</w:t>
+      </w:r>
+    </w:p>
+    <w:p>
+      <w:r>
+        <w:t>Table</w:t>
+      </w:r>
+    </w:p>
+    <w:p>
+      <w:r>
+        <w:t>Labels</w:t>
+      </w:r>
+    </w:p>
+    <w:p/>
+    <w:p>
+      <w:r>
+        <w:t>SkillsSection.tsx</w:t>
+      </w:r>
+    </w:p>
+    <w:p>
+      <w:r>
+        <w:t>Label</w:t>
       </w:r>
     </w:p>
     <w:sectPr>
@@ -2613,6 +2589,7 @@
   <w:style w:type="character" w:default="1" w:styleId="DefaultParagraphFont">
     <w:name w:val="Default Paragraph Font"/>
     <w:uiPriority w:val="1"/>
+    <w:semiHidden/>
     <w:unhideWhenUsed/>
   </w:style>
   <w:style w:type="table" w:default="1" w:styleId="TableNormal">

</xml_diff>

<commit_message>
Polish About me page
</commit_message>
<xml_diff>
--- a/rn-porfolio content.docx
+++ b/rn-porfolio content.docx
@@ -1349,9 +1349,38 @@
         <w:t xml:space="preserve"> DevTools</w:t>
       </w:r>
     </w:p>
-    <w:p/>
-    <w:p>
-      <w:r>
+    <w:p>
+      <w:pPr>
+        <w:rPr>
+          <w:b/>
+          <w:bCs/>
+        </w:rPr>
+      </w:pPr>
+      <w:r>
+        <w:rPr>
+          <w:b/>
+          <w:bCs/>
+        </w:rPr>
+        <w:t>Herosection</w:t>
+      </w:r>
+    </w:p>
+    <w:p>
+      <w:r>
+        <w:t>HeroImage</w:t>
+      </w:r>
+    </w:p>
+    <w:p>
+      <w:pPr>
+        <w:rPr>
+          <w:b/>
+          <w:bCs/>
+        </w:rPr>
+      </w:pPr>
+      <w:r>
+        <w:rPr>
+          <w:b/>
+          <w:bCs/>
+        </w:rPr>
         <w:t>ProjectsSection.tsx</w:t>
       </w:r>
     </w:p>
@@ -1372,23 +1401,80 @@
     </w:p>
     <w:p>
       <w:r>
+        <w:t>Labels</w:t>
+      </w:r>
+    </w:p>
+    <w:p>
+      <w:r>
+        <w:rPr>
+          <w:b/>
+          <w:bCs/>
+        </w:rPr>
+        <w:t>Resource</w:t>
+      </w:r>
+      <w:r>
+        <w:rPr>
+          <w:b/>
+          <w:bCs/>
+        </w:rPr>
+        <w:br/>
+      </w:r>
+      <w:r>
+        <w:t>Img</w:t>
+      </w:r>
+      <w:r>
+        <w:br/>
+        <w:t>Button</w:t>
+      </w:r>
+    </w:p>
+    <w:p>
+      <w:pPr>
+        <w:rPr>
+          <w:b/>
+          <w:bCs/>
+        </w:rPr>
+      </w:pPr>
+      <w:r>
+        <w:rPr>
+          <w:b/>
+          <w:bCs/>
+        </w:rPr>
+        <w:t>Setup</w:t>
+      </w:r>
+    </w:p>
+    <w:p>
+      <w:r>
+        <w:lastRenderedPageBreak/>
         <w:t>Table</w:t>
       </w:r>
     </w:p>
     <w:p>
-      <w:r>
-        <w:t>Labels</w:t>
-      </w:r>
-    </w:p>
-    <w:p/>
-    <w:p>
-      <w:r>
+      <w:pPr>
+        <w:rPr>
+          <w:b/>
+          <w:bCs/>
+        </w:rPr>
+      </w:pPr>
+      <w:r>
+        <w:rPr>
+          <w:b/>
+          <w:bCs/>
+        </w:rPr>
         <w:t>SkillsSection.tsx</w:t>
       </w:r>
     </w:p>
     <w:p>
+      <w:pPr>
+        <w:pStyle w:val="NoSpacing"/>
+        <w:spacing w:after="160" w:line="278" w:lineRule="auto"/>
+      </w:pPr>
       <w:r>
         <w:t>Label</w:t>
+      </w:r>
+    </w:p>
+    <w:p>
+      <w:r>
+        <w:t>Text</w:t>
       </w:r>
     </w:p>
     <w:sectPr>

</xml_diff>